<commit_message>
added documentation on connectors used. To fit battery, iin battery sandwhich design as well as potential components on the back-side of the board
</commit_message>
<xml_diff>
--- a/generalDesign_documentation/GenericNodeDesignDecisionDocumentation.docx
+++ b/generalDesign_documentation/GenericNodeDesignDecisionDocumentation.docx
@@ -99,8 +99,13 @@
           </w:tcPr>
           <w:p>
             <w:r>
-              <w:t>Custom pcb</w:t>
+              <w:t xml:space="preserve">Custom </w:t>
             </w:r>
+            <w:proofErr w:type="spellStart"/>
+            <w:r>
+              <w:t>pcb</w:t>
+            </w:r>
+            <w:proofErr w:type="spellEnd"/>
           </w:p>
         </w:tc>
         <w:tc>
@@ -228,6 +233,9 @@
       <w:r>
         <w:t>Battery</w:t>
       </w:r>
+      <w:r>
+        <w:t xml:space="preserve"> – 20mm x 12mm x 5mm</w:t>
+      </w:r>
     </w:p>
     <w:p>
       <w:pPr>
@@ -242,13 +250,253 @@
         <w:pStyle w:val="NoSpacing"/>
       </w:pPr>
       <w:r>
-        <w:t>Custom SensorPCB</w:t>
+        <w:t xml:space="preserve">Custom </w:t>
+      </w:r>
+      <w:proofErr w:type="spellStart"/>
+      <w:r>
+        <w:t>SensorPCB</w:t>
+      </w:r>
+      <w:proofErr w:type="spellEnd"/>
+    </w:p>
+    <w:p/>
+    <w:p>
+      <w:pPr>
+        <w:rPr>
+          <w:b/>
+          <w:bCs/>
+        </w:rPr>
+      </w:pPr>
+      <w:r>
+        <w:rPr>
+          <w:b/>
+          <w:bCs/>
+        </w:rPr>
+        <w:t>Link for 5.08 mm female headers. Gives 0.8mm offset. This seems to be the standard which seems to fit perfectly. Hopefully.</w:t>
+      </w:r>
+    </w:p>
+    <w:p>
+      <w:hyperlink r:id="rId5" w:history="1">
+        <w:r>
+          <w:rPr>
+            <w:rStyle w:val="Hyperlink"/>
+          </w:rPr>
+          <w:t>https://www.digikey.ca/en/products/filter/rectangular-connectors/headers-receptacles-female-sockets/315?s=N4IgjCBcpg7AnABiqAxlAZgQwDYGcBTAGhAHsoBtEeWAJgDYQBdEgBwBcoQBldgJwCWAOwD</w:t>
+        </w:r>
+        <w:r>
+          <w:rPr>
+            <w:rStyle w:val="Hyperlink"/>
+          </w:rPr>
+          <w:t>m</w:t>
+        </w:r>
+        <w:r>
+          <w:rPr>
+            <w:rStyle w:val="Hyperlink"/>
+          </w:rPr>
+          <w:t>IAL4kw8ABzwUIdJGz5iZSiGRNJIWojAyFSlYRLlIVMABZaVgMzM2nSD37CxOgLS0jUfgFc1cyoAVmZxCKA</w:t>
+        </w:r>
+      </w:hyperlink>
+    </w:p>
+    <w:p/>
+    <w:p>
+      <w:pPr>
+        <w:rPr>
+          <w:b/>
+          <w:bCs/>
+        </w:rPr>
+      </w:pPr>
+      <w:r>
+        <w:rPr>
+          <w:b/>
+          <w:bCs/>
+        </w:rPr>
+        <w:t xml:space="preserve">5.08mm male headers </w:t>
+      </w:r>
+    </w:p>
+    <w:p>
+      <w:hyperlink r:id="rId6" w:history="1">
+        <w:r>
+          <w:rPr>
+            <w:rStyle w:val="Hyperlink"/>
+          </w:rPr>
+          <w:t>https://www.digikey.ca/en/pro</w:t>
+        </w:r>
+        <w:r>
+          <w:rPr>
+            <w:rStyle w:val="Hyperlink"/>
+          </w:rPr>
+          <w:t>d</w:t>
+        </w:r>
+        <w:r>
+          <w:rPr>
+            <w:rStyle w:val="Hyperlink"/>
+          </w:rPr>
+          <w:t>ucts/filter/headers-male-pins/314?s=N4IgjCBcpg7AnABiqAxlAZgQwDYGcBTAGhAHsoBtEeWAJgDYQBdEgBwBcoQBldgJwCWAOwDmIAL4kw8ABzwUIdJGz5iZSiGRNJIWojAyFSlYRLlIVMABZaVgMzM2nSD37CxOvbQjRFmXKbqFiBWcDIArPIsIBxcvIKiEiQAtLRGUPwArmrmVOHM4oVAA</w:t>
+        </w:r>
+      </w:hyperlink>
+    </w:p>
+    <w:p/>
+    <w:p>
+      <w:pPr>
+        <w:rPr>
+          <w:b/>
+          <w:bCs/>
+        </w:rPr>
+      </w:pPr>
+      <w:r>
+        <w:rPr>
+          <w:b/>
+          <w:bCs/>
+        </w:rPr>
+        <w:t>The MALE/FEMALE headers for PPG need to be a bit bigger, to allow component placement.</w:t>
+      </w:r>
+    </w:p>
+    <w:p>
+      <w:pPr>
+        <w:keepNext/>
+      </w:pPr>
+      <w:r>
+        <w:rPr>
+          <w:b/>
+          <w:bCs/>
+        </w:rPr>
+        <w:drawing>
+          <wp:inline distT="0" distB="0" distL="0" distR="0" wp14:anchorId="6261990D" wp14:editId="68F4804C">
+            <wp:extent cx="5943600" cy="3387090"/>
+            <wp:effectExtent l="0" t="0" r="0" b="3810"/>
+            <wp:docPr id="617408892" name="Picture 1"/>
+            <wp:cNvGraphicFramePr>
+              <a:graphicFrameLocks xmlns:a="http://schemas.openxmlformats.org/drawingml/2006/main" noChangeAspect="1"/>
+            </wp:cNvGraphicFramePr>
+            <a:graphic xmlns:a="http://schemas.openxmlformats.org/drawingml/2006/main">
+              <a:graphicData uri="http://schemas.openxmlformats.org/drawingml/2006/picture">
+                <pic:pic xmlns:pic="http://schemas.openxmlformats.org/drawingml/2006/picture">
+                  <pic:nvPicPr>
+                    <pic:cNvPr id="617408892" name=""/>
+                    <pic:cNvPicPr/>
+                  </pic:nvPicPr>
+                  <pic:blipFill>
+                    <a:blip r:embed="rId7"/>
+                    <a:stretch>
+                      <a:fillRect/>
+                    </a:stretch>
+                  </pic:blipFill>
+                  <pic:spPr>
+                    <a:xfrm>
+                      <a:off x="0" y="0"/>
+                      <a:ext cx="5943600" cy="3387090"/>
+                    </a:xfrm>
+                    <a:prstGeom prst="rect">
+                      <a:avLst/>
+                    </a:prstGeom>
+                  </pic:spPr>
+                </pic:pic>
+              </a:graphicData>
+            </a:graphic>
+          </wp:inline>
+        </w:drawing>
+      </w:r>
+    </w:p>
+    <w:p>
+      <w:pPr>
+        <w:pStyle w:val="Caption"/>
+        <w:rPr>
+          <w:b/>
+          <w:bCs/>
+        </w:rPr>
+      </w:pPr>
+      <w:r>
+        <w:t xml:space="preserve">Figure </w:t>
+      </w:r>
+      <w:fldSimple w:instr=" SEQ Figure \* ARABIC ">
+        <w:r>
+          <w:rPr>
+            <w:noProof/>
+          </w:rPr>
+          <w:t>1</w:t>
+        </w:r>
+      </w:fldSimple>
+      <w:r>
+        <w:t xml:space="preserve"> 0805 resistor height</w:t>
+      </w:r>
+    </w:p>
+    <w:p>
+      <w:r>
+        <w:t xml:space="preserve">According to the </w:t>
+      </w:r>
+      <w:r>
+        <w:t>0805-component</w:t>
+      </w:r>
+      <w:r>
+        <w:t xml:space="preserve"> sheet. We should allow offset of 1.5mm </w:t>
+      </w:r>
+      <w:proofErr w:type="spellStart"/>
+      <w:r>
+        <w:t>atleast</w:t>
+      </w:r>
+      <w:proofErr w:type="spellEnd"/>
+      <w:r>
+        <w:t xml:space="preserve">. </w:t>
+      </w:r>
+      <w:r>
+        <w:t xml:space="preserve">We will choose 7mm </w:t>
+      </w:r>
+      <w:r>
+        <w:t>height headers.</w:t>
+      </w:r>
+    </w:p>
+    <w:p>
+      <w:r>
+        <w:t xml:space="preserve">Female  - </w:t>
+      </w:r>
+      <w:hyperlink r:id="rId8" w:history="1">
+        <w:r>
+          <w:rPr>
+            <w:rStyle w:val="Hyperlink"/>
+          </w:rPr>
+          <w:t xml:space="preserve">0.100" (2.54mm) Headers, Receptacles, Female Sockets | Rectangular Connectors | Electronic Components Distributor </w:t>
+        </w:r>
+        <w:proofErr w:type="spellStart"/>
+        <w:r>
+          <w:rPr>
+            <w:rStyle w:val="Hyperlink"/>
+          </w:rPr>
+          <w:t>DigiKey</w:t>
+        </w:r>
+        <w:proofErr w:type="spellEnd"/>
+      </w:hyperlink>
+    </w:p>
+    <w:p>
+      <w:r>
+        <w:t xml:space="preserve">Male - </w:t>
+      </w:r>
+      <w:hyperlink r:id="rId9" w:history="1">
+        <w:r>
+          <w:rPr>
+            <w:rStyle w:val="Hyperlink"/>
+          </w:rPr>
+          <w:t xml:space="preserve">0.100" (2.54mm) Headers, Male Pins | Rectangular Connectors | Electronic Components Distributor </w:t>
+        </w:r>
+        <w:proofErr w:type="spellStart"/>
+        <w:r>
+          <w:rPr>
+            <w:rStyle w:val="Hyperlink"/>
+          </w:rPr>
+          <w:t>DigiKey</w:t>
+        </w:r>
+        <w:proofErr w:type="spellEnd"/>
+      </w:hyperlink>
+    </w:p>
+    <w:p/>
+    <w:p>
+      <w:r>
+        <w:lastRenderedPageBreak/>
+        <w:t>Header connections should be GOLD to maximize conductivity.</w:t>
       </w:r>
     </w:p>
     <w:p/>
     <w:p/>
     <w:p>
-      <w:hyperlink r:id="rId5" w:history="1">
+      <w:hyperlink r:id="rId10" w:history="1">
         <w:r>
           <w:rPr>
             <w:rStyle w:val="Hyperlink"/>
@@ -260,7 +508,9 @@
     <w:p/>
     <w:p>
       <w:r>
-        <w:lastRenderedPageBreak/>
+        <w:rPr>
+          <w:noProof/>
+        </w:rPr>
         <w:drawing>
           <wp:inline distT="0" distB="0" distL="0" distR="0" wp14:anchorId="31D468FC" wp14:editId="3CCC5BCC">
             <wp:extent cx="4782217" cy="5458587"/>
@@ -277,7 +527,7 @@
                     <pic:cNvPicPr/>
                   </pic:nvPicPr>
                   <pic:blipFill>
-                    <a:blip r:embed="rId6"/>
+                    <a:blip r:embed="rId11"/>
                     <a:stretch>
                       <a:fillRect/>
                     </a:stretch>
@@ -1034,7 +1284,6 @@
   <w:style w:type="character" w:default="1" w:styleId="DefaultParagraphFont">
     <w:name w:val="Default Paragraph Font"/>
     <w:uiPriority w:val="1"/>
-    <w:semiHidden/>
     <w:unhideWhenUsed/>
   </w:style>
   <w:style w:type="table" w:default="1" w:styleId="TableNormal">
@@ -1397,6 +1646,37 @@
     <w:pPr>
       <w:spacing w:after="0" w:line="240" w:lineRule="auto"/>
     </w:pPr>
+  </w:style>
+  <w:style w:type="character" w:styleId="FollowedHyperlink">
+    <w:name w:val="FollowedHyperlink"/>
+    <w:basedOn w:val="DefaultParagraphFont"/>
+    <w:uiPriority w:val="99"/>
+    <w:semiHidden/>
+    <w:unhideWhenUsed/>
+    <w:rsid w:val="00DA5F9D"/>
+    <w:rPr>
+      <w:color w:val="96607D" w:themeColor="followedHyperlink"/>
+      <w:u w:val="single"/>
+    </w:rPr>
+  </w:style>
+  <w:style w:type="paragraph" w:styleId="Caption">
+    <w:name w:val="caption"/>
+    <w:basedOn w:val="Normal"/>
+    <w:next w:val="Normal"/>
+    <w:uiPriority w:val="35"/>
+    <w:unhideWhenUsed/>
+    <w:qFormat/>
+    <w:rsid w:val="00DA5F9D"/>
+    <w:pPr>
+      <w:spacing w:after="200" w:line="240" w:lineRule="auto"/>
+    </w:pPr>
+    <w:rPr>
+      <w:i/>
+      <w:iCs/>
+      <w:color w:val="0E2841" w:themeColor="text2"/>
+      <w:sz w:val="18"/>
+      <w:szCs w:val="18"/>
+    </w:rPr>
   </w:style>
 </w:styles>
 </file>

</xml_diff>